<commit_message>
cambios finales en interno, ya se puede usar
</commit_message>
<xml_diff>
--- a/public/assets/documents/template-word/template_correspondencia_interno.docx
+++ b/public/assets/documents/template-word/template_correspondencia_interno.docx
@@ -227,8 +227,8 @@
         <w:tblLook w:val="04A0" w:firstRow="1" w:lastRow="0" w:firstColumn="1" w:lastColumn="0" w:noHBand="0" w:noVBand="1"/>
       </w:tblPr>
       <w:tblGrid>
-        <w:gridCol w:w="2263"/>
-        <w:gridCol w:w="4820"/>
+        <w:gridCol w:w="1838"/>
+        <w:gridCol w:w="5245"/>
         <w:gridCol w:w="1984"/>
         <w:gridCol w:w="1570"/>
       </w:tblGrid>
@@ -238,7 +238,7 @@
         </w:trPr>
         <w:tc>
           <w:tcPr>
-            <w:tcW w:w="2263" w:type="dxa"/>
+            <w:tcW w:w="1838" w:type="dxa"/>
             <w:tcBorders>
               <w:bottom w:val="nil"/>
               <w:right w:val="single" w:sz="18" w:space="0" w:color="FFFFFF" w:themeColor="background1"/>
@@ -268,7 +268,7 @@
         </w:tc>
         <w:tc>
           <w:tcPr>
-            <w:tcW w:w="4820" w:type="dxa"/>
+            <w:tcW w:w="5245" w:type="dxa"/>
             <w:tcBorders>
               <w:left w:val="single" w:sz="18" w:space="0" w:color="FFFFFF" w:themeColor="background1"/>
               <w:bottom w:val="nil"/>
@@ -364,7 +364,7 @@
         </w:trPr>
         <w:tc>
           <w:tcPr>
-            <w:tcW w:w="2263" w:type="dxa"/>
+            <w:tcW w:w="1838" w:type="dxa"/>
             <w:tcBorders>
               <w:top w:val="nil"/>
               <w:left w:val="nil"/>
@@ -408,7 +408,7 @@
         </w:tc>
         <w:tc>
           <w:tcPr>
-            <w:tcW w:w="4820" w:type="dxa"/>
+            <w:tcW w:w="5245" w:type="dxa"/>
             <w:tcBorders>
               <w:top w:val="nil"/>
               <w:left w:val="nil"/>
@@ -503,7 +503,7 @@
         </w:trPr>
         <w:tc>
           <w:tcPr>
-            <w:tcW w:w="2263" w:type="dxa"/>
+            <w:tcW w:w="1838" w:type="dxa"/>
             <w:tcBorders>
               <w:top w:val="nil"/>
               <w:left w:val="single" w:sz="18" w:space="0" w:color="FFFFFF" w:themeColor="background1"/>
@@ -538,7 +538,7 @@
         </w:tc>
         <w:tc>
           <w:tcPr>
-            <w:tcW w:w="4820" w:type="dxa"/>
+            <w:tcW w:w="5245" w:type="dxa"/>
             <w:tcBorders>
               <w:top w:val="nil"/>
               <w:left w:val="single" w:sz="18" w:space="0" w:color="FFFFFF" w:themeColor="background1"/>
@@ -631,7 +631,7 @@
         </w:trPr>
         <w:tc>
           <w:tcPr>
-            <w:tcW w:w="2263" w:type="dxa"/>
+            <w:tcW w:w="1838" w:type="dxa"/>
             <w:tcBorders>
               <w:top w:val="nil"/>
               <w:left w:val="nil"/>
@@ -659,7 +659,7 @@
         </w:tc>
         <w:tc>
           <w:tcPr>
-            <w:tcW w:w="4820" w:type="dxa"/>
+            <w:tcW w:w="5245" w:type="dxa"/>
             <w:tcBorders>
               <w:top w:val="nil"/>
               <w:left w:val="single" w:sz="18" w:space="0" w:color="FFFFFF" w:themeColor="background1"/>
@@ -764,8 +764,8 @@
         <w:tblLook w:val="04A0" w:firstRow="1" w:lastRow="0" w:firstColumn="1" w:lastColumn="0" w:noHBand="0" w:noVBand="1"/>
       </w:tblPr>
       <w:tblGrid>
-        <w:gridCol w:w="2268"/>
-        <w:gridCol w:w="8359"/>
+        <w:gridCol w:w="1843"/>
+        <w:gridCol w:w="8784"/>
       </w:tblGrid>
       <w:tr>
         <w:trPr>
@@ -773,7 +773,7 @@
         </w:trPr>
         <w:tc>
           <w:tcPr>
-            <w:tcW w:w="2268" w:type="dxa"/>
+            <w:tcW w:w="1843" w:type="dxa"/>
             <w:shd w:val="clear" w:color="auto" w:fill="D9D9D9" w:themeFill="background1" w:themeFillShade="D9"/>
             <w:vAlign w:val="center"/>
           </w:tcPr>
@@ -797,7 +797,7 @@
         </w:tc>
         <w:tc>
           <w:tcPr>
-            <w:tcW w:w="8359" w:type="dxa"/>
+            <w:tcW w:w="8784" w:type="dxa"/>
             <w:shd w:val="clear" w:color="auto" w:fill="D9D9D9" w:themeFill="background1" w:themeFillShade="D9"/>
             <w:vAlign w:val="center"/>
           </w:tcPr>
@@ -823,7 +823,7 @@
         </w:trPr>
         <w:tc>
           <w:tcPr>
-            <w:tcW w:w="2268" w:type="dxa"/>
+            <w:tcW w:w="1843" w:type="dxa"/>
             <w:shd w:val="clear" w:color="auto" w:fill="FFFFFF" w:themeFill="background1"/>
             <w:vAlign w:val="center"/>
           </w:tcPr>
@@ -847,7 +847,7 @@
         </w:tc>
         <w:tc>
           <w:tcPr>
-            <w:tcW w:w="8359" w:type="dxa"/>
+            <w:tcW w:w="8784" w:type="dxa"/>
             <w:shd w:val="clear" w:color="auto" w:fill="FFFFFF" w:themeFill="background1"/>
             <w:vAlign w:val="center"/>
           </w:tcPr>
@@ -894,7 +894,7 @@
         </w:trPr>
         <w:tc>
           <w:tcPr>
-            <w:tcW w:w="2268" w:type="dxa"/>
+            <w:tcW w:w="1843" w:type="dxa"/>
             <w:shd w:val="clear" w:color="auto" w:fill="D9D9D9" w:themeFill="background1" w:themeFillShade="D9"/>
             <w:vAlign w:val="center"/>
           </w:tcPr>
@@ -918,7 +918,7 @@
         </w:tc>
         <w:tc>
           <w:tcPr>
-            <w:tcW w:w="8359" w:type="dxa"/>
+            <w:tcW w:w="8784" w:type="dxa"/>
             <w:shd w:val="clear" w:color="auto" w:fill="D9D9D9" w:themeFill="background1" w:themeFillShade="D9"/>
             <w:vAlign w:val="center"/>
           </w:tcPr>
@@ -958,7 +958,7 @@
         </w:trPr>
         <w:tc>
           <w:tcPr>
-            <w:tcW w:w="2268" w:type="dxa"/>
+            <w:tcW w:w="1843" w:type="dxa"/>
             <w:shd w:val="clear" w:color="auto" w:fill="FFFFFF" w:themeFill="background1"/>
             <w:vAlign w:val="center"/>
           </w:tcPr>
@@ -982,7 +982,7 @@
         </w:tc>
         <w:tc>
           <w:tcPr>
-            <w:tcW w:w="8359" w:type="dxa"/>
+            <w:tcW w:w="8784" w:type="dxa"/>
             <w:shd w:val="clear" w:color="auto" w:fill="FFFFFF" w:themeFill="background1"/>
             <w:vAlign w:val="center"/>
           </w:tcPr>

</xml_diff>